<commit_message>
docs: fix missing blank line before AI callout to resolve Quarto warning
</commit_message>
<xml_diff>
--- a/qmd/DigComp3.0-Nederlands.docx
+++ b/qmd/DigComp3.0-Nederlands.docx
@@ -1826,7 +1826,7 @@
     </w:p>
     <w:bookmarkEnd w:id="37"/>
     <w:bookmarkEnd w:id="38"/>
-    <w:bookmarkStart w:id="60" w:name="sec-digcomp-3.0-raamwerkcomponenten"/>
+    <w:bookmarkStart w:id="62" w:name="sec-digcomp-3.0-raamwerkcomponenten"/>
     <w:p>
       <w:pPr>
         <w:pStyle w:val="Heading1"/>
@@ -3331,7 +3331,7 @@
       </w:r>
     </w:p>
     <w:bookmarkEnd w:id="56"/>
-    <w:bookmarkStart w:id="59" w:name="ai-competentie"/>
+    <w:bookmarkStart w:id="61" w:name="ai-competentie"/>
     <w:p>
       <w:pPr>
         <w:pStyle w:val="Heading2"/>
@@ -3408,34 +3408,132 @@
       <w:r>
         <w:t xml:space="preserve">In DigComp 3.0 definiëren we AI volgens de AI-verordening (artikel 3, lid 1):</w:t>
       </w:r>
-      <w:r>
-        <w:t xml:space="preserve"> </w:t>
-      </w:r>
-      <w:r>
-        <w:t xml:space="preserve">::: {.callout-note}</w:t>
-      </w:r>
-      <w:r>
-        <w:t xml:space="preserve"> </w:t>
-      </w:r>
-      <w:r>
-        <w:t xml:space="preserve">…een op een machine gebaseerd systeem dat is ontworpen om te werken met variërende niveaus van autonomie, dat na de uitrol aanpassingsvermogen kan vertonen en dat, voor expliciete of impliciete doelstellingen, uit de ontvangen input afleidt hoe output moet worden gegenereerd, zoals voorspellingen, inhoud, aanbevelingen of beslissingen die fysieke of virtuele omgevingen kunnen beïnvloeden. Deze definitie hanteert een levenscyclusperspectief en omvat zowel de fase vóór de uitrol als de uitrol zelf</w:t>
-      </w:r>
-      <w:r>
-        <w:rPr>
-          <w:rStyle w:val="FootnoteReference"/>
-        </w:rPr>
-        <w:footnoteReference w:id="57"/>
-      </w:r>
-      <w:r>
-        <w:t xml:space="preserve">.</w:t>
-      </w:r>
-      <w:r>
-        <w:t xml:space="preserve"> </w:t>
-      </w:r>
-      <w:r>
-        <w:t xml:space="preserve">:::</w:t>
-      </w:r>
-    </w:p>
+    </w:p>
+    <w:tbl>
+      <w:tblPr>
+        <w:tblStyle w:val="Table"/>
+        <w:tblLook w:firstRow="0" w:lastRow="0" w:firstColumn="0" w:lastColumn="0" w:noHBand="0" w:noVBand="0" w:val="0000"/>
+        <w:tblBorders>
+          <w:top w:val="single" w:sz="4" w:space="0" w:color="0758E5"/>
+          <w:left w:val="single" w:sz="24" w:space="0" w:color="0758E5"/>
+          <w:bottom w:val="single" w:sz="4" w:space="0" w:color="0758E5"/>
+          <w:right w:val="single" w:sz="4" w:space="0" w:color="0758E5"/>
+        </w:tblBorders>
+        <w:tblCellMar>
+          <w:left w:w="144" w:type="dxa"/>
+          <w:right w:w="144" w:type="dxa"/>
+        </w:tblCellMar>
+        <w:tblLook w:firstRow="0" w:lastRow="0" w:firstColumn="0" w:lastColumn="0" w:noHBand="0" w:noVBand="0" w:val="0000"/>
+      </w:tblPr>
+      <w:tr>
+        <w:trPr>
+          <w:cantSplit/>
+        </w:trPr>
+        <w:tc>
+          <w:tcPr>
+            <w:shd w:color="auto" w:fill="dae6fb" w:val="clear"/>
+            <w:tcMar>
+              <w:top w:w="92" w:type="dxa"/>
+              <w:bottom w:w="92" w:type="dxa"/>
+            </w:tcMar>
+          </w:tcPr>
+          <w:p>
+            <w:pPr>
+              <w:pStyle w:val="BodyText"/>
+            </w:pPr>
+            <w:pPr>
+              <w:spacing w:before="0" w:after="0"/>
+              <w:textAlignment w:val="center"/>
+            </w:pPr>
+            <w:r>
+              <w:drawing>
+                <wp:inline>
+                  <wp:extent cx="152400" cy="152400"/>
+                  <wp:effectExtent b="0" l="0" r="0" t="0"/>
+                  <wp:docPr descr="" title="" id="57" name="Picture"/>
+                  <a:graphic>
+                    <a:graphicData uri="http://schemas.openxmlformats.org/drawingml/2006/picture">
+                      <pic:pic>
+                        <pic:nvPicPr>
+                          <pic:cNvPr descr="C:\Program Files\Quarto\share\formats\docx\note.png" id="58" name="Picture"/>
+                          <pic:cNvPicPr>
+                            <a:picLocks noChangeArrowheads="1" noChangeAspect="1"/>
+                          </pic:cNvPicPr>
+                        </pic:nvPicPr>
+                        <pic:blipFill>
+                          <a:blip r:embed="rId51"/>
+                          <a:stretch>
+                            <a:fillRect/>
+                          </a:stretch>
+                        </pic:blipFill>
+                        <pic:spPr bwMode="auto">
+                          <a:xfrm>
+                            <a:off x="0" y="0"/>
+                            <a:ext cx="152400" cy="152400"/>
+                          </a:xfrm>
+                          <a:prstGeom prst="rect">
+                            <a:avLst/>
+                          </a:prstGeom>
+                          <a:noFill/>
+                          <a:ln w="9525">
+                            <a:noFill/>
+                            <a:headEnd/>
+                            <a:tailEnd/>
+                          </a:ln>
+                        </pic:spPr>
+                      </pic:pic>
+                    </a:graphicData>
+                  </a:graphic>
+                </wp:inline>
+              </w:drawing>
+            </w:r>
+            <w:r>
+              <w:t xml:space="preserve"> </w:t>
+            </w:r>
+            <w:r>
+              <w:t xml:space="preserve"> </w:t>
+            </w:r>
+            <w:r>
+              <w:t xml:space="preserve">Opmerking</w:t>
+            </w:r>
+          </w:p>
+        </w:tc>
+      </w:tr>
+      <w:tr>
+        <w:trPr>
+          <w:cantSplit/>
+        </w:trPr>
+        <w:tc>
+          <w:tcPr>
+            <w:tcMar>
+              <w:top w:w="108" w:type="dxa"/>
+              <w:bottom w:w="108" w:type="dxa"/>
+            </w:tcMar>
+          </w:tcPr>
+          <w:p>
+            <w:pPr>
+              <w:pStyle w:val="BodyText"/>
+            </w:pPr>
+            <w:pPr>
+              <w:spacing w:before="16" w:after="16"/>
+            </w:pPr>
+            <w:r>
+              <w:t xml:space="preserve">…een op een machine gebaseerd systeem dat is ontworpen om te werken met variërende niveaus van autonomie, dat na de uitrol aanpassingsvermogen kan vertonen en dat, voor expliciete of impliciete doelstellingen, uit de ontvangen input afleidt hoe output moet worden gegenereerd, zoals voorspellingen, inhoud, aanbevelingen of beslissingen die fysieke of virtuele omgevingen kunnen beïnvloeden. Deze definitie hanteert een levenscyclusperspectief en omvat zowel de fase vóór de uitrol als de uitrol zelf</w:t>
+            </w:r>
+            <w:r>
+              <w:rPr>
+                <w:rStyle w:val="FootnoteReference"/>
+              </w:rPr>
+              <w:footnoteReference w:id="59"/>
+            </w:r>
+            <w:r>
+              <w:t xml:space="preserve">.</w:t>
+            </w:r>
+          </w:p>
+          <w:p/>
+        </w:tc>
+      </w:tr>
+    </w:tbl>
     <w:p>
       <w:pPr>
         <w:pStyle w:val="BodyText"/>
@@ -3516,9 +3614,9 @@
         <w:br w:type="page"/>
       </w:r>
     </w:p>
-    <w:bookmarkEnd w:id="59"/>
-    <w:bookmarkEnd w:id="60"/>
-    <w:bookmarkStart w:id="64" w:name="sec-raamwerk"/>
+    <w:bookmarkEnd w:id="61"/>
+    <w:bookmarkEnd w:id="62"/>
+    <w:bookmarkStart w:id="66" w:name="sec-raamwerk"/>
     <w:p>
       <w:pPr>
         <w:pStyle w:val="Heading1"/>
@@ -3527,7 +3625,7 @@
         <w:t xml:space="preserve">3. DigComp 3.0 raamwerk</w:t>
       </w:r>
     </w:p>
-    <w:bookmarkStart w:id="61" w:name="hoe-moet-je-het-raamwerk-lezen"/>
+    <w:bookmarkStart w:id="63" w:name="hoe-moet-je-het-raamwerk-lezen"/>
     <w:p>
       <w:pPr>
         <w:pStyle w:val="Heading2"/>
@@ -3547,8 +3645,8 @@
         <w:t xml:space="preserve">Hier moet een mooi plaatje komen met hoe je de tabel die volgt moet lezen, vergelijkbaar met pagina 9 van de vorige keer.</w:t>
       </w:r>
     </w:p>
-    <w:bookmarkEnd w:id="61"/>
-    <w:bookmarkStart w:id="63" w:name="digcomp-3.0"/>
+    <w:bookmarkEnd w:id="63"/>
+    <w:bookmarkStart w:id="65" w:name="digcomp-3.0"/>
     <w:p>
       <w:pPr>
         <w:pStyle w:val="Heading2"/>
@@ -3570,7 +3668,7 @@
       <w:tr>
         <w:tc>
           <w:tcPr/>
-          <w:bookmarkStart w:id="62" w:name="tbl-digcomp3"/>
+          <w:bookmarkStart w:id="64" w:name="tbl-digcomp3"/>
           <w:p>
             <w:pPr>
               <w:jc w:val="center"/>
@@ -3604,7 +3702,7 @@
               </w:tc>
             </w:tr>
           </w:tbl>
-          <w:bookmarkEnd w:id="62"/>
+          <w:bookmarkEnd w:id="64"/>
           <w:p/>
         </w:tc>
       </w:tr>
@@ -3628,9 +3726,9 @@
         <w:t xml:space="preserve">tabel digcomp3 is ook als los .docx-bestand beschikbaar: DigComp3_digcomp3_nl.docx</w:t>
       </w:r>
     </w:p>
-    <w:bookmarkEnd w:id="63"/>
-    <w:bookmarkEnd w:id="64"/>
-    <w:bookmarkStart w:id="66" w:name="sec-bijlage-leerresultaten"/>
+    <w:bookmarkEnd w:id="65"/>
+    <w:bookmarkEnd w:id="66"/>
+    <w:bookmarkStart w:id="68" w:name="sec-bijlage-leerresultaten"/>
     <w:p>
       <w:pPr>
         <w:pStyle w:val="Heading1"/>
@@ -3652,7 +3750,7 @@
       <w:tr>
         <w:tc>
           <w:tcPr/>
-          <w:bookmarkStart w:id="65" w:name="tbl-outcomes"/>
+          <w:bookmarkStart w:id="67" w:name="tbl-outcomes"/>
           <w:p>
             <w:pPr>
               <w:jc w:val="center"/>
@@ -3686,7 +3784,7 @@
               </w:tc>
             </w:tr>
           </w:tbl>
-          <w:bookmarkEnd w:id="65"/>
+          <w:bookmarkEnd w:id="67"/>
           <w:p/>
         </w:tc>
       </w:tr>
@@ -3726,8 +3824,8 @@
         <w:br w:type="page"/>
       </w:r>
     </w:p>
-    <w:bookmarkEnd w:id="66"/>
-    <w:bookmarkStart w:id="68" w:name="sec-woordenlijst"/>
+    <w:bookmarkEnd w:id="68"/>
+    <w:bookmarkStart w:id="70" w:name="sec-woordenlijst"/>
     <w:p>
       <w:pPr>
         <w:pStyle w:val="Heading1"/>
@@ -3749,7 +3847,7 @@
       <w:tr>
         <w:tc>
           <w:tcPr/>
-          <w:bookmarkStart w:id="67" w:name="tbl-woordenlijst"/>
+          <w:bookmarkStart w:id="69" w:name="tbl-woordenlijst"/>
           <w:p>
             <w:pPr>
               <w:jc w:val="center"/>
@@ -3783,7 +3881,7 @@
               </w:tc>
             </w:tr>
           </w:tbl>
-          <w:bookmarkEnd w:id="67"/>
+          <w:bookmarkEnd w:id="69"/>
           <w:p/>
         </w:tc>
       </w:tr>
@@ -3823,8 +3921,8 @@
         <w:br w:type="page"/>
       </w:r>
     </w:p>
-    <w:bookmarkEnd w:id="68"/>
-    <w:bookmarkStart w:id="69" w:name="aanvullende-bronnen"/>
+    <w:bookmarkEnd w:id="70"/>
+    <w:bookmarkStart w:id="71" w:name="aanvullende-bronnen"/>
     <w:p>
       <w:pPr>
         <w:pStyle w:val="Heading1"/>
@@ -3849,8 +3947,8 @@
         <w:br w:type="page"/>
       </w:r>
     </w:p>
-    <w:bookmarkEnd w:id="69"/>
-    <w:bookmarkStart w:id="147" w:name="literatuur"/>
+    <w:bookmarkEnd w:id="71"/>
+    <w:bookmarkStart w:id="149" w:name="literatuur"/>
     <w:p>
       <w:pPr>
         <w:pStyle w:val="Heading1"/>
@@ -3859,8 +3957,8 @@
         <w:t xml:space="preserve">Literatuur</w:t>
       </w:r>
     </w:p>
-    <w:bookmarkStart w:id="146" w:name="refs"/>
-    <w:bookmarkStart w:id="71" w:name="ref-Abendroth-Dias2025"/>
+    <w:bookmarkStart w:id="148" w:name="refs"/>
+    <w:bookmarkStart w:id="73" w:name="ref-Abendroth-Dias2025"/>
     <w:p>
       <w:pPr>
         <w:pStyle w:val="Bibliography"/>
@@ -3915,7 +4013,7 @@
       <w:r>
         <w:t xml:space="preserve"> </w:t>
       </w:r>
-      <w:hyperlink r:id="rId70">
+      <w:hyperlink r:id="rId72">
         <w:r>
           <w:rPr>
             <w:rStyle w:val="Hyperlink"/>
@@ -3924,8 +4022,8 @@
         </w:r>
       </w:hyperlink>
     </w:p>
-    <w:bookmarkEnd w:id="71"/>
-    <w:bookmarkStart w:id="73" w:name="ref-Boerkamp2024"/>
+    <w:bookmarkEnd w:id="73"/>
+    <w:bookmarkStart w:id="75" w:name="ref-Boerkamp2024"/>
     <w:p>
       <w:pPr>
         <w:pStyle w:val="Bibliography"/>
@@ -3962,7 +4060,7 @@
       <w:r>
         <w:t xml:space="preserve"> </w:t>
       </w:r>
-      <w:hyperlink r:id="rId72">
+      <w:hyperlink r:id="rId74">
         <w:r>
           <w:rPr>
             <w:rStyle w:val="Hyperlink"/>
@@ -3971,8 +4069,8 @@
         </w:r>
       </w:hyperlink>
     </w:p>
-    <w:bookmarkEnd w:id="73"/>
-    <w:bookmarkStart w:id="75" w:name="ref-Brundle2025"/>
+    <w:bookmarkEnd w:id="75"/>
+    <w:bookmarkStart w:id="77" w:name="ref-Brundle2025"/>
     <w:p>
       <w:pPr>
         <w:pStyle w:val="Bibliography"/>
@@ -4021,7 +4119,7 @@
       <w:r>
         <w:t xml:space="preserve"> </w:t>
       </w:r>
-      <w:hyperlink r:id="rId74">
+      <w:hyperlink r:id="rId76">
         <w:r>
           <w:rPr>
             <w:rStyle w:val="Hyperlink"/>
@@ -4030,8 +4128,8 @@
         </w:r>
       </w:hyperlink>
     </w:p>
-    <w:bookmarkEnd w:id="75"/>
-    <w:bookmarkStart w:id="77" w:name="ref-Cedefop2017"/>
+    <w:bookmarkEnd w:id="77"/>
+    <w:bookmarkStart w:id="79" w:name="ref-Cedefop2017"/>
     <w:p>
       <w:pPr>
         <w:pStyle w:val="Bibliography"/>
@@ -4055,7 +4153,7 @@
       <w:r>
         <w:t xml:space="preserve"> </w:t>
       </w:r>
-      <w:hyperlink r:id="rId76">
+      <w:hyperlink r:id="rId78">
         <w:r>
           <w:rPr>
             <w:rStyle w:val="Hyperlink"/>
@@ -4064,8 +4162,8 @@
         </w:r>
       </w:hyperlink>
     </w:p>
-    <w:bookmarkEnd w:id="77"/>
-    <w:bookmarkStart w:id="79" w:name="ref-Cedefop2022"/>
+    <w:bookmarkEnd w:id="79"/>
+    <w:bookmarkStart w:id="81" w:name="ref-Cedefop2022"/>
     <w:p>
       <w:pPr>
         <w:pStyle w:val="Bibliography"/>
@@ -4089,7 +4187,7 @@
       <w:r>
         <w:t xml:space="preserve"> </w:t>
       </w:r>
-      <w:hyperlink r:id="rId78">
+      <w:hyperlink r:id="rId80">
         <w:r>
           <w:rPr>
             <w:rStyle w:val="Hyperlink"/>
@@ -4098,8 +4196,8 @@
         </w:r>
       </w:hyperlink>
     </w:p>
-    <w:bookmarkEnd w:id="79"/>
-    <w:bookmarkStart w:id="81" w:name="ref-Cedefop2024a"/>
+    <w:bookmarkEnd w:id="81"/>
+    <w:bookmarkStart w:id="83" w:name="ref-Cedefop2024a"/>
     <w:p>
       <w:pPr>
         <w:pStyle w:val="Bibliography"/>
@@ -4123,7 +4221,7 @@
       <w:r>
         <w:t xml:space="preserve"> </w:t>
       </w:r>
-      <w:hyperlink r:id="rId80">
+      <w:hyperlink r:id="rId82">
         <w:r>
           <w:rPr>
             <w:rStyle w:val="Hyperlink"/>
@@ -4132,8 +4230,8 @@
         </w:r>
       </w:hyperlink>
     </w:p>
-    <w:bookmarkEnd w:id="81"/>
-    <w:bookmarkStart w:id="83" w:name="ref-Centeno2025"/>
+    <w:bookmarkEnd w:id="83"/>
+    <w:bookmarkStart w:id="85" w:name="ref-Centeno2025"/>
     <w:p>
       <w:pPr>
         <w:pStyle w:val="Bibliography"/>
@@ -4157,7 +4255,7 @@
       <w:r>
         <w:t xml:space="preserve"> </w:t>
       </w:r>
-      <w:hyperlink r:id="rId82">
+      <w:hyperlink r:id="rId84">
         <w:r>
           <w:rPr>
             <w:rStyle w:val="Hyperlink"/>
@@ -4166,8 +4264,8 @@
         </w:r>
       </w:hyperlink>
     </w:p>
-    <w:bookmarkEnd w:id="83"/>
-    <w:bookmarkStart w:id="85" w:name="ref-Centeno2024a"/>
+    <w:bookmarkEnd w:id="85"/>
+    <w:bookmarkStart w:id="87" w:name="ref-Centeno2024a"/>
     <w:p>
       <w:pPr>
         <w:pStyle w:val="Bibliography"/>
@@ -4205,7 +4303,7 @@
       <w:r>
         <w:t xml:space="preserve"> </w:t>
       </w:r>
-      <w:hyperlink r:id="rId84">
+      <w:hyperlink r:id="rId86">
         <w:r>
           <w:rPr>
             <w:rStyle w:val="Hyperlink"/>
@@ -4214,8 +4312,8 @@
         </w:r>
       </w:hyperlink>
     </w:p>
-    <w:bookmarkEnd w:id="85"/>
-    <w:bookmarkStart w:id="86" w:name="ref-Centeno2024b"/>
+    <w:bookmarkEnd w:id="87"/>
+    <w:bookmarkStart w:id="88" w:name="ref-Centeno2024b"/>
     <w:p>
       <w:pPr>
         <w:pStyle w:val="Bibliography"/>
@@ -4253,7 +4351,7 @@
       <w:r>
         <w:t xml:space="preserve"> </w:t>
       </w:r>
-      <w:hyperlink r:id="rId84">
+      <w:hyperlink r:id="rId86">
         <w:r>
           <w:rPr>
             <w:rStyle w:val="Hyperlink"/>
@@ -4262,8 +4360,8 @@
         </w:r>
       </w:hyperlink>
     </w:p>
-    <w:bookmarkEnd w:id="86"/>
-    <w:bookmarkStart w:id="88" w:name="ref-Chen2023"/>
+    <w:bookmarkEnd w:id="88"/>
+    <w:bookmarkStart w:id="90" w:name="ref-Chen2023"/>
     <w:p>
       <w:pPr>
         <w:pStyle w:val="Bibliography"/>
@@ -4300,7 +4398,7 @@
       <w:r>
         <w:t xml:space="preserve"> </w:t>
       </w:r>
-      <w:hyperlink r:id="rId87">
+      <w:hyperlink r:id="rId89">
         <w:r>
           <w:rPr>
             <w:rStyle w:val="Hyperlink"/>
@@ -4309,8 +4407,8 @@
         </w:r>
       </w:hyperlink>
     </w:p>
-    <w:bookmarkEnd w:id="88"/>
-    <w:bookmarkStart w:id="90" w:name="ref-DiVinadio2022"/>
+    <w:bookmarkEnd w:id="90"/>
+    <w:bookmarkStart w:id="92" w:name="ref-DiVinadio2022"/>
     <w:p>
       <w:pPr>
         <w:pStyle w:val="Bibliography"/>
@@ -4334,7 +4432,7 @@
       <w:r>
         <w:t xml:space="preserve"> </w:t>
       </w:r>
-      <w:hyperlink r:id="rId89">
+      <w:hyperlink r:id="rId91">
         <w:r>
           <w:rPr>
             <w:rStyle w:val="Hyperlink"/>
@@ -4343,8 +4441,8 @@
         </w:r>
       </w:hyperlink>
     </w:p>
-    <w:bookmarkEnd w:id="90"/>
-    <w:bookmarkStart w:id="92" w:name="ref-Draghi2024"/>
+    <w:bookmarkEnd w:id="92"/>
+    <w:bookmarkStart w:id="94" w:name="ref-Draghi2024"/>
     <w:p>
       <w:pPr>
         <w:pStyle w:val="Bibliography"/>
@@ -4368,7 +4466,7 @@
       <w:r>
         <w:t xml:space="preserve"> </w:t>
       </w:r>
-      <w:hyperlink r:id="rId91">
+      <w:hyperlink r:id="rId93">
         <w:r>
           <w:rPr>
             <w:rStyle w:val="Hyperlink"/>
@@ -4377,8 +4475,8 @@
         </w:r>
       </w:hyperlink>
     </w:p>
-    <w:bookmarkEnd w:id="92"/>
-    <w:bookmarkStart w:id="94" w:name="ref-Duckworth2025"/>
+    <w:bookmarkEnd w:id="94"/>
+    <w:bookmarkStart w:id="96" w:name="ref-Duckworth2025"/>
     <w:p>
       <w:pPr>
         <w:pStyle w:val="Bibliography"/>
@@ -4405,7 +4503,7 @@
       <w:r>
         <w:t xml:space="preserve"> </w:t>
       </w:r>
-      <w:hyperlink r:id="rId93">
+      <w:hyperlink r:id="rId95">
         <w:r>
           <w:rPr>
             <w:rStyle w:val="Hyperlink"/>
@@ -4414,8 +4512,8 @@
         </w:r>
       </w:hyperlink>
     </w:p>
-    <w:bookmarkEnd w:id="94"/>
-    <w:bookmarkStart w:id="96" w:name="ref-Commission2012"/>
+    <w:bookmarkEnd w:id="96"/>
+    <w:bookmarkStart w:id="98" w:name="ref-Commission2012"/>
     <w:p>
       <w:pPr>
         <w:pStyle w:val="Bibliography"/>
@@ -4439,7 +4537,7 @@
       <w:r>
         <w:t xml:space="preserve"> </w:t>
       </w:r>
-      <w:hyperlink r:id="rId95">
+      <w:hyperlink r:id="rId97">
         <w:r>
           <w:rPr>
             <w:rStyle w:val="Hyperlink"/>
@@ -4448,8 +4546,8 @@
         </w:r>
       </w:hyperlink>
     </w:p>
-    <w:bookmarkEnd w:id="96"/>
-    <w:bookmarkStart w:id="98" w:name="ref-Commission2018"/>
+    <w:bookmarkEnd w:id="98"/>
+    <w:bookmarkStart w:id="100" w:name="ref-Commission2018"/>
     <w:p>
       <w:pPr>
         <w:pStyle w:val="Bibliography"/>
@@ -4473,7 +4571,7 @@
       <w:r>
         <w:t xml:space="preserve"> </w:t>
       </w:r>
-      <w:hyperlink r:id="rId97">
+      <w:hyperlink r:id="rId99">
         <w:r>
           <w:rPr>
             <w:rStyle w:val="Hyperlink"/>
@@ -4482,8 +4580,8 @@
         </w:r>
       </w:hyperlink>
     </w:p>
-    <w:bookmarkEnd w:id="98"/>
-    <w:bookmarkStart w:id="100" w:name="ref-Commission2023b"/>
+    <w:bookmarkEnd w:id="100"/>
+    <w:bookmarkStart w:id="102" w:name="ref-Commission2023b"/>
     <w:p>
       <w:pPr>
         <w:pStyle w:val="Bibliography"/>
@@ -4507,7 +4605,7 @@
       <w:r>
         <w:t xml:space="preserve"> </w:t>
       </w:r>
-      <w:hyperlink r:id="rId99">
+      <w:hyperlink r:id="rId101">
         <w:r>
           <w:rPr>
             <w:rStyle w:val="Hyperlink"/>
@@ -4516,8 +4614,8 @@
         </w:r>
       </w:hyperlink>
     </w:p>
-    <w:bookmarkEnd w:id="100"/>
-    <w:bookmarkStart w:id="102" w:name="ref-Commission2023a"/>
+    <w:bookmarkEnd w:id="102"/>
+    <w:bookmarkStart w:id="104" w:name="ref-Commission2023a"/>
     <w:p>
       <w:pPr>
         <w:pStyle w:val="Bibliography"/>
@@ -4541,7 +4639,7 @@
       <w:r>
         <w:t xml:space="preserve"> </w:t>
       </w:r>
-      <w:hyperlink r:id="rId101">
+      <w:hyperlink r:id="rId103">
         <w:r>
           <w:rPr>
             <w:rStyle w:val="Hyperlink"/>
@@ -4550,8 +4648,8 @@
         </w:r>
       </w:hyperlink>
     </w:p>
-    <w:bookmarkEnd w:id="102"/>
-    <w:bookmarkStart w:id="104" w:name="ref-Commission2025b"/>
+    <w:bookmarkEnd w:id="104"/>
+    <w:bookmarkStart w:id="106" w:name="ref-Commission2025b"/>
     <w:p>
       <w:pPr>
         <w:pStyle w:val="Bibliography"/>
@@ -4575,7 +4673,7 @@
       <w:r>
         <w:t xml:space="preserve"> </w:t>
       </w:r>
-      <w:hyperlink r:id="rId103">
+      <w:hyperlink r:id="rId105">
         <w:r>
           <w:rPr>
             <w:rStyle w:val="Hyperlink"/>
@@ -4584,8 +4682,8 @@
         </w:r>
       </w:hyperlink>
     </w:p>
-    <w:bookmarkEnd w:id="104"/>
-    <w:bookmarkStart w:id="105" w:name="ref-Commission2025f"/>
+    <w:bookmarkEnd w:id="106"/>
+    <w:bookmarkStart w:id="107" w:name="ref-Commission2025f"/>
     <w:p>
       <w:pPr>
         <w:pStyle w:val="Bibliography"/>
@@ -4623,7 +4721,7 @@
       <w:r>
         <w:t xml:space="preserve"> </w:t>
       </w:r>
-      <w:hyperlink r:id="rId58">
+      <w:hyperlink r:id="rId60">
         <w:r>
           <w:rPr>
             <w:rStyle w:val="Hyperlink"/>
@@ -4632,8 +4730,8 @@
         </w:r>
       </w:hyperlink>
     </w:p>
-    <w:bookmarkEnd w:id="105"/>
-    <w:bookmarkStart w:id="107" w:name="ref-Commission2025a"/>
+    <w:bookmarkEnd w:id="107"/>
+    <w:bookmarkStart w:id="109" w:name="ref-Commission2025a"/>
     <w:p>
       <w:pPr>
         <w:pStyle w:val="Bibliography"/>
@@ -4685,7 +4783,7 @@
       <w:r>
         <w:t xml:space="preserve"> </w:t>
       </w:r>
-      <w:hyperlink r:id="rId106">
+      <w:hyperlink r:id="rId108">
         <w:r>
           <w:rPr>
             <w:rStyle w:val="Hyperlink"/>
@@ -4694,8 +4792,8 @@
         </w:r>
       </w:hyperlink>
     </w:p>
-    <w:bookmarkEnd w:id="107"/>
-    <w:bookmarkStart w:id="109" w:name="ref-Eurostat2025"/>
+    <w:bookmarkEnd w:id="109"/>
+    <w:bookmarkStart w:id="111" w:name="ref-Eurostat2025"/>
     <w:p>
       <w:pPr>
         <w:pStyle w:val="Bibliography"/>
@@ -4747,7 +4845,7 @@
       <w:r>
         <w:t xml:space="preserve"> </w:t>
       </w:r>
-      <w:hyperlink r:id="rId108">
+      <w:hyperlink r:id="rId110">
         <w:r>
           <w:rPr>
             <w:rStyle w:val="Hyperlink"/>
@@ -4756,8 +4854,8 @@
         </w:r>
       </w:hyperlink>
     </w:p>
-    <w:bookmarkEnd w:id="109"/>
-    <w:bookmarkStart w:id="111" w:name="ref-FariasGaytan2023"/>
+    <w:bookmarkEnd w:id="111"/>
+    <w:bookmarkStart w:id="113" w:name="ref-FariasGaytan2023"/>
     <w:p>
       <w:pPr>
         <w:pStyle w:val="Bibliography"/>
@@ -4794,7 +4892,7 @@
       <w:r>
         <w:t xml:space="preserve"> </w:t>
       </w:r>
-      <w:hyperlink r:id="rId110">
+      <w:hyperlink r:id="rId112">
         <w:r>
           <w:rPr>
             <w:rStyle w:val="Hyperlink"/>
@@ -4803,8 +4901,8 @@
         </w:r>
       </w:hyperlink>
     </w:p>
-    <w:bookmarkEnd w:id="111"/>
-    <w:bookmarkStart w:id="113" w:name="ref-Kluzer2020"/>
+    <w:bookmarkEnd w:id="113"/>
+    <w:bookmarkStart w:id="115" w:name="ref-Kluzer2020"/>
     <w:p>
       <w:pPr>
         <w:pStyle w:val="Bibliography"/>
@@ -4828,7 +4926,7 @@
       <w:r>
         <w:t xml:space="preserve"> </w:t>
       </w:r>
-      <w:hyperlink r:id="rId112">
+      <w:hyperlink r:id="rId114">
         <w:r>
           <w:rPr>
             <w:rStyle w:val="Hyperlink"/>
@@ -4837,8 +4935,8 @@
         </w:r>
       </w:hyperlink>
     </w:p>
-    <w:bookmarkEnd w:id="113"/>
-    <w:bookmarkStart w:id="115" w:name="ref-Lewandowsky2020"/>
+    <w:bookmarkEnd w:id="115"/>
+    <w:bookmarkStart w:id="117" w:name="ref-Lewandowsky2020"/>
     <w:p>
       <w:pPr>
         <w:pStyle w:val="Bibliography"/>
@@ -4862,7 +4960,7 @@
       <w:r>
         <w:t xml:space="preserve"> </w:t>
       </w:r>
-      <w:hyperlink r:id="rId114">
+      <w:hyperlink r:id="rId116">
         <w:r>
           <w:rPr>
             <w:rStyle w:val="Hyperlink"/>
@@ -4871,8 +4969,8 @@
         </w:r>
       </w:hyperlink>
     </w:p>
-    <w:bookmarkEnd w:id="115"/>
-    <w:bookmarkStart w:id="117" w:name="ref-Long2020"/>
+    <w:bookmarkEnd w:id="117"/>
+    <w:bookmarkStart w:id="119" w:name="ref-Long2020"/>
     <w:p>
       <w:pPr>
         <w:pStyle w:val="Bibliography"/>
@@ -4936,7 +5034,7 @@
       <w:r>
         <w:t xml:space="preserve"> </w:t>
       </w:r>
-      <w:hyperlink r:id="rId116">
+      <w:hyperlink r:id="rId118">
         <w:r>
           <w:rPr>
             <w:rStyle w:val="Hyperlink"/>
@@ -4945,8 +5043,8 @@
         </w:r>
       </w:hyperlink>
     </w:p>
-    <w:bookmarkEnd w:id="117"/>
-    <w:bookmarkStart w:id="119" w:name="ref-Miao2024"/>
+    <w:bookmarkEnd w:id="119"/>
+    <w:bookmarkStart w:id="121" w:name="ref-Miao2024"/>
     <w:p>
       <w:pPr>
         <w:pStyle w:val="Bibliography"/>
@@ -4984,7 +5082,7 @@
       <w:r>
         <w:t xml:space="preserve"> </w:t>
       </w:r>
-      <w:hyperlink r:id="rId118">
+      <w:hyperlink r:id="rId120">
         <w:r>
           <w:rPr>
             <w:rStyle w:val="Hyperlink"/>
@@ -4993,8 +5091,8 @@
         </w:r>
       </w:hyperlink>
     </w:p>
-    <w:bookmarkEnd w:id="119"/>
-    <w:bookmarkStart w:id="121" w:name="ref-Mills2024"/>
+    <w:bookmarkEnd w:id="121"/>
+    <w:bookmarkStart w:id="123" w:name="ref-Mills2024"/>
     <w:p>
       <w:pPr>
         <w:pStyle w:val="Bibliography"/>
@@ -5032,7 +5130,7 @@
       <w:r>
         <w:t xml:space="preserve"> </w:t>
       </w:r>
-      <w:hyperlink r:id="rId120">
+      <w:hyperlink r:id="rId122">
         <w:r>
           <w:rPr>
             <w:rStyle w:val="Hyperlink"/>
@@ -5041,8 +5139,8 @@
         </w:r>
       </w:hyperlink>
     </w:p>
-    <w:bookmarkEnd w:id="121"/>
-    <w:bookmarkStart w:id="123" w:name="ref-MorteNadal2025"/>
+    <w:bookmarkEnd w:id="123"/>
+    <w:bookmarkStart w:id="125" w:name="ref-MorteNadal2025"/>
     <w:p>
       <w:pPr>
         <w:pStyle w:val="Bibliography"/>
@@ -5079,7 +5177,7 @@
       <w:r>
         <w:t xml:space="preserve"> </w:t>
       </w:r>
-      <w:hyperlink r:id="rId122">
+      <w:hyperlink r:id="rId124">
         <w:r>
           <w:rPr>
             <w:rStyle w:val="Hyperlink"/>
@@ -5088,8 +5186,8 @@
         </w:r>
       </w:hyperlink>
     </w:p>
-    <w:bookmarkEnd w:id="123"/>
-    <w:bookmarkStart w:id="125" w:name="ref-Ng2021"/>
+    <w:bookmarkEnd w:id="125"/>
+    <w:bookmarkStart w:id="127" w:name="ref-Ng2021"/>
     <w:p>
       <w:pPr>
         <w:pStyle w:val="Bibliography"/>
@@ -5138,7 +5236,7 @@
       <w:r>
         <w:t xml:space="preserve"> </w:t>
       </w:r>
-      <w:hyperlink r:id="rId124">
+      <w:hyperlink r:id="rId126">
         <w:r>
           <w:rPr>
             <w:rStyle w:val="Hyperlink"/>
@@ -5147,8 +5245,8 @@
         </w:r>
       </w:hyperlink>
     </w:p>
-    <w:bookmarkEnd w:id="125"/>
-    <w:bookmarkStart w:id="127" w:name="ref-OECD2025"/>
+    <w:bookmarkEnd w:id="127"/>
+    <w:bookmarkStart w:id="129" w:name="ref-OECD2025"/>
     <w:p>
       <w:pPr>
         <w:pStyle w:val="Bibliography"/>
@@ -5221,7 +5319,7 @@
       <w:r>
         <w:t xml:space="preserve"> </w:t>
       </w:r>
-      <w:hyperlink r:id="rId126">
+      <w:hyperlink r:id="rId128">
         <w:r>
           <w:rPr>
             <w:rStyle w:val="Hyperlink"/>
@@ -5230,8 +5328,8 @@
         </w:r>
       </w:hyperlink>
     </w:p>
-    <w:bookmarkEnd w:id="127"/>
-    <w:bookmarkStart w:id="129" w:name="ref-OnesiOzigagun2024"/>
+    <w:bookmarkEnd w:id="129"/>
+    <w:bookmarkStart w:id="131" w:name="ref-OnesiOzigagun2024"/>
     <w:p>
       <w:pPr>
         <w:pStyle w:val="Bibliography"/>
@@ -5277,7 +5375,7 @@
       <w:r>
         <w:t xml:space="preserve"> </w:t>
       </w:r>
-      <w:hyperlink r:id="rId128">
+      <w:hyperlink r:id="rId130">
         <w:r>
           <w:rPr>
             <w:rStyle w:val="Hyperlink"/>
@@ -5286,8 +5384,8 @@
         </w:r>
       </w:hyperlink>
     </w:p>
-    <w:bookmarkEnd w:id="129"/>
-    <w:bookmarkStart w:id="131" w:name="ref-Pakhnenko2025"/>
+    <w:bookmarkEnd w:id="131"/>
+    <w:bookmarkStart w:id="133" w:name="ref-Pakhnenko2025"/>
     <w:p>
       <w:pPr>
         <w:pStyle w:val="Bibliography"/>
@@ -5324,7 +5422,7 @@
       <w:r>
         <w:t xml:space="preserve"> </w:t>
       </w:r>
-      <w:hyperlink r:id="rId130">
+      <w:hyperlink r:id="rId132">
         <w:r>
           <w:rPr>
             <w:rStyle w:val="Hyperlink"/>
@@ -5333,8 +5431,8 @@
         </w:r>
       </w:hyperlink>
     </w:p>
-    <w:bookmarkEnd w:id="131"/>
-    <w:bookmarkStart w:id="133" w:name="ref-Pouliakas2025"/>
+    <w:bookmarkEnd w:id="133"/>
+    <w:bookmarkStart w:id="135" w:name="ref-Pouliakas2025"/>
     <w:p>
       <w:pPr>
         <w:pStyle w:val="Bibliography"/>
@@ -5370,7 +5468,7 @@
       <w:r>
         <w:t xml:space="preserve"> </w:t>
       </w:r>
-      <w:hyperlink r:id="rId132">
+      <w:hyperlink r:id="rId134">
         <w:r>
           <w:rPr>
             <w:rStyle w:val="Hyperlink"/>
@@ -5379,8 +5477,8 @@
         </w:r>
       </w:hyperlink>
     </w:p>
-    <w:bookmarkEnd w:id="133"/>
-    <w:bookmarkStart w:id="135" w:name="ref-Stalmach2023"/>
+    <w:bookmarkEnd w:id="135"/>
+    <w:bookmarkStart w:id="137" w:name="ref-Stalmach2023"/>
     <w:p>
       <w:pPr>
         <w:pStyle w:val="Bibliography"/>
@@ -5417,7 +5515,7 @@
       <w:r>
         <w:t xml:space="preserve"> </w:t>
       </w:r>
-      <w:hyperlink r:id="rId134">
+      <w:hyperlink r:id="rId136">
         <w:r>
           <w:rPr>
             <w:rStyle w:val="Hyperlink"/>
@@ -5426,8 +5524,8 @@
         </w:r>
       </w:hyperlink>
     </w:p>
-    <w:bookmarkEnd w:id="135"/>
-    <w:bookmarkStart w:id="137" w:name="ref-Tarca2024"/>
+    <w:bookmarkEnd w:id="137"/>
+    <w:bookmarkStart w:id="139" w:name="ref-Tarca2024"/>
     <w:p>
       <w:pPr>
         <w:pStyle w:val="Bibliography"/>
@@ -5473,7 +5571,7 @@
       <w:r>
         <w:t xml:space="preserve"> </w:t>
       </w:r>
-      <w:hyperlink r:id="rId136">
+      <w:hyperlink r:id="rId138">
         <w:r>
           <w:rPr>
             <w:rStyle w:val="Hyperlink"/>
@@ -5482,8 +5580,8 @@
         </w:r>
       </w:hyperlink>
     </w:p>
-    <w:bookmarkEnd w:id="137"/>
-    <w:bookmarkStart w:id="139" w:name="ref-Touretzky2019"/>
+    <w:bookmarkEnd w:id="139"/>
+    <w:bookmarkStart w:id="141" w:name="ref-Touretzky2019"/>
     <w:p>
       <w:pPr>
         <w:pStyle w:val="Bibliography"/>
@@ -5578,7 +5676,7 @@
       <w:r>
         <w:t xml:space="preserve"> </w:t>
       </w:r>
-      <w:hyperlink r:id="rId138">
+      <w:hyperlink r:id="rId140">
         <w:r>
           <w:rPr>
             <w:rStyle w:val="Hyperlink"/>
@@ -5587,8 +5685,8 @@
         </w:r>
       </w:hyperlink>
     </w:p>
-    <w:bookmarkEnd w:id="139"/>
-    <w:bookmarkStart w:id="141" w:name="ref-Touretzky2023"/>
+    <w:bookmarkEnd w:id="141"/>
+    <w:bookmarkStart w:id="143" w:name="ref-Touretzky2023"/>
     <w:p>
       <w:pPr>
         <w:pStyle w:val="Bibliography"/>
@@ -5625,7 +5723,7 @@
       <w:r>
         <w:t xml:space="preserve"> </w:t>
       </w:r>
-      <w:hyperlink r:id="rId140">
+      <w:hyperlink r:id="rId142">
         <w:r>
           <w:rPr>
             <w:rStyle w:val="Hyperlink"/>
@@ -5634,8 +5732,8 @@
         </w:r>
       </w:hyperlink>
     </w:p>
-    <w:bookmarkEnd w:id="141"/>
-    <w:bookmarkStart w:id="143" w:name="ref-UNESCO2022"/>
+    <w:bookmarkEnd w:id="143"/>
+    <w:bookmarkStart w:id="145" w:name="ref-UNESCO2022"/>
     <w:p>
       <w:pPr>
         <w:pStyle w:val="Bibliography"/>
@@ -5701,7 +5799,7 @@
       <w:r>
         <w:t xml:space="preserve"> </w:t>
       </w:r>
-      <w:hyperlink r:id="rId142">
+      <w:hyperlink r:id="rId144">
         <w:r>
           <w:rPr>
             <w:rStyle w:val="Hyperlink"/>
@@ -5710,8 +5808,8 @@
         </w:r>
       </w:hyperlink>
     </w:p>
-    <w:bookmarkEnd w:id="143"/>
-    <w:bookmarkStart w:id="145" w:name="ref-Vuorikari2022b"/>
+    <w:bookmarkEnd w:id="145"/>
+    <w:bookmarkStart w:id="147" w:name="ref-Vuorikari2022b"/>
     <w:p>
       <w:pPr>
         <w:pStyle w:val="Bibliography"/>
@@ -5756,7 +5854,7 @@
       <w:r>
         <w:t xml:space="preserve"> </w:t>
       </w:r>
-      <w:hyperlink r:id="rId144">
+      <w:hyperlink r:id="rId146">
         <w:r>
           <w:rPr>
             <w:rStyle w:val="Hyperlink"/>
@@ -5765,9 +5863,9 @@
         </w:r>
       </w:hyperlink>
     </w:p>
-    <w:bookmarkEnd w:id="145"/>
-    <w:bookmarkEnd w:id="146"/>
     <w:bookmarkEnd w:id="147"/>
+    <w:bookmarkEnd w:id="148"/>
+    <w:bookmarkEnd w:id="149"/>
     <w:sectPr>
       <w:footnotePr>
         <w:numRestart w:val="eachSect"/>
@@ -5892,7 +5990,7 @@
       </w:r>
     </w:p>
   </w:footnote>
-  <w:footnote w:id="57">
+  <w:footnote w:id="59">
     <w:p>
       <w:pPr>
         <w:pStyle w:val="FootnoteText"/>
@@ -5912,7 +6010,7 @@
       <w:r>
         <w:t xml:space="preserve"> </w:t>
       </w:r>
-      <w:hyperlink r:id="rId58">
+      <w:hyperlink r:id="rId60">
         <w:r>
           <w:rPr>
             <w:rStyle w:val="Hyperlink"/>

</xml_diff>

<commit_message>
docs: user updates to date, references, and layout
</commit_message>
<xml_diff>
--- a/qmd/DigComp3.0-Nederlands.docx
+++ b/qmd/DigComp3.0-Nederlands.docx
@@ -23,7 +23,7 @@
         <w:pStyle w:val="Date"/>
       </w:pPr>
       <w:r>
-        <w:t xml:space="preserve">2026-03-06</w:t>
+        <w:t xml:space="preserve">2026-03-09</w:t>
       </w:r>
     </w:p>
     <w:sdt>
@@ -1826,7 +1826,7 @@
     </w:p>
     <w:bookmarkEnd w:id="37"/>
     <w:bookmarkEnd w:id="38"/>
-    <w:bookmarkStart w:id="62" w:name="sec-digcomp-3.0-raamwerkcomponenten"/>
+    <w:bookmarkStart w:id="61" w:name="sec-digcomp-3.0-raamwerkcomponenten"/>
     <w:p>
       <w:pPr>
         <w:pStyle w:val="Heading1"/>
@@ -2523,22 +2523,13 @@
       </w:r>
     </w:p>
     <w:bookmarkEnd w:id="47"/>
-    <w:bookmarkStart w:id="50" w:name="sec-beheersingsniveaus"/>
+    <w:bookmarkStart w:id="49" w:name="sec-beheersingsniveaus"/>
     <w:p>
       <w:pPr>
         <w:pStyle w:val="Heading2"/>
       </w:pPr>
       <w:r>
         <w:t xml:space="preserve">2.4 Beheersingsniveaus</w:t>
-      </w:r>
-    </w:p>
-    <w:bookmarkStart w:id="49" w:name="beschrijvingen-van-beheersingsniveaus"/>
-    <w:p>
-      <w:pPr>
-        <w:pStyle w:val="Heading3"/>
-      </w:pPr>
-      <w:r>
-        <w:t xml:space="preserve">Beschrijvingen van beheersingsniveaus</w:t>
       </w:r>
     </w:p>
     <w:p>
@@ -2956,8 +2947,7 @@
       </w:r>
     </w:p>
     <w:bookmarkEnd w:id="49"/>
-    <w:bookmarkEnd w:id="50"/>
-    <w:bookmarkStart w:id="56" w:name="sec-leerresultaten"/>
+    <w:bookmarkStart w:id="55" w:name="sec-leerresultaten"/>
     <w:p>
       <w:pPr>
         <w:pStyle w:val="Heading2"/>
@@ -3007,18 +2997,18 @@
                 <wp:inline>
                   <wp:extent cx="152400" cy="152400"/>
                   <wp:effectExtent b="0" l="0" r="0" t="0"/>
-                  <wp:docPr descr="" title="" id="52" name="Picture"/>
+                  <wp:docPr descr="" title="" id="51" name="Picture"/>
                   <a:graphic>
                     <a:graphicData uri="http://schemas.openxmlformats.org/drawingml/2006/picture">
                       <pic:pic>
                         <pic:nvPicPr>
-                          <pic:cNvPr descr="C:\Program Files\Quarto\share\formats\docx\note.png" id="53" name="Picture"/>
+                          <pic:cNvPr descr="C:\Program Files\Quarto\share\formats\docx\note.png" id="52" name="Picture"/>
                           <pic:cNvPicPr>
                             <a:picLocks noChangeArrowheads="1" noChangeAspect="1"/>
                           </pic:cNvPicPr>
                         </pic:nvPicPr>
                         <pic:blipFill>
-                          <a:blip r:embed="rId51"/>
+                          <a:blip r:embed="rId50"/>
                           <a:stretch>
                             <a:fillRect/>
                           </a:stretch>
@@ -3131,18 +3121,18 @@
                 <wp:inline>
                   <wp:extent cx="152400" cy="152400"/>
                   <wp:effectExtent b="0" l="0" r="0" t="0"/>
-                  <wp:docPr descr="" title="" id="54" name="Picture"/>
+                  <wp:docPr descr="" title="" id="53" name="Picture"/>
                   <a:graphic>
                     <a:graphicData uri="http://schemas.openxmlformats.org/drawingml/2006/picture">
                       <pic:pic>
                         <pic:nvPicPr>
-                          <pic:cNvPr descr="C:\Program Files\Quarto\share\formats\docx\note.png" id="55" name="Picture"/>
+                          <pic:cNvPr descr="C:\Program Files\Quarto\share\formats\docx\note.png" id="54" name="Picture"/>
                           <pic:cNvPicPr>
                             <a:picLocks noChangeArrowheads="1" noChangeAspect="1"/>
                           </pic:cNvPicPr>
                         </pic:nvPicPr>
                         <pic:blipFill>
-                          <a:blip r:embed="rId51"/>
+                          <a:blip r:embed="rId50"/>
                           <a:stretch>
                             <a:fillRect/>
                           </a:stretch>
@@ -3265,12 +3255,14 @@
       <w:r>
         <w:t xml:space="preserve"> </w:t>
       </w:r>
-      <w:r>
-        <w:rPr>
-          <w:highlight w:val="yellow"/>
-        </w:rPr>
-        <w:t xml:space="preserve">bijlage 2</w:t>
-      </w:r>
+      <w:hyperlink w:anchor="sec-leerresultaten">
+        <w:r>
+          <w:rPr>
+            <w:rStyle w:val="Hyperlink"/>
+          </w:rPr>
+          <w:t xml:space="preserve">Paragraaf 2.5</w:t>
+        </w:r>
+      </w:hyperlink>
       <w:r>
         <w:t xml:space="preserve">, met veel overeenkomsten in bewoording, maar maken geen onderscheid tussen kennis, vaardigheden of houdingen.</w:t>
       </w:r>
@@ -3330,8 +3322,8 @@
         <w:t xml:space="preserve">. Voor de ontwikkeling van DigComp 3.0 heeft het JRC, met input van experts en belanghebbenden, zorgvuldig gekeken naar de balans tussen specificiteit en algemeenheid om ervoor te zorgen dat de bewoordingen van de leerresultaten voldoende generiek zijn om in verschillende contexten te worden toegepast, terwijl ze tegelijkertijd voldoende nauwkeurig zijn om helder en ondubbelzinnig te zijn.</w:t>
       </w:r>
     </w:p>
-    <w:bookmarkEnd w:id="56"/>
-    <w:bookmarkStart w:id="61" w:name="ai-competentie"/>
+    <w:bookmarkEnd w:id="55"/>
+    <w:bookmarkStart w:id="60" w:name="ai-competentie"/>
     <w:p>
       <w:pPr>
         <w:pStyle w:val="Heading2"/>
@@ -3450,18 +3442,18 @@
                 <wp:inline>
                   <wp:extent cx="152400" cy="152400"/>
                   <wp:effectExtent b="0" l="0" r="0" t="0"/>
-                  <wp:docPr descr="" title="" id="57" name="Picture"/>
+                  <wp:docPr descr="" title="" id="56" name="Picture"/>
                   <a:graphic>
                     <a:graphicData uri="http://schemas.openxmlformats.org/drawingml/2006/picture">
                       <pic:pic>
                         <pic:nvPicPr>
-                          <pic:cNvPr descr="C:\Program Files\Quarto\share\formats\docx\note.png" id="58" name="Picture"/>
+                          <pic:cNvPr descr="C:\Program Files\Quarto\share\formats\docx\note.png" id="57" name="Picture"/>
                           <pic:cNvPicPr>
                             <a:picLocks noChangeArrowheads="1" noChangeAspect="1"/>
                           </pic:cNvPicPr>
                         </pic:nvPicPr>
                         <pic:blipFill>
-                          <a:blip r:embed="rId51"/>
+                          <a:blip r:embed="rId50"/>
                           <a:stretch>
                             <a:fillRect/>
                           </a:stretch>
@@ -3524,7 +3516,7 @@
               <w:rPr>
                 <w:rStyle w:val="FootnoteReference"/>
               </w:rPr>
-              <w:footnoteReference w:id="59"/>
+              <w:footnoteReference w:id="58"/>
             </w:r>
             <w:r>
               <w:t xml:space="preserve">.</w:t>
@@ -3614,39 +3606,39 @@
         <w:br w:type="page"/>
       </w:r>
     </w:p>
+    <w:bookmarkEnd w:id="60"/>
     <w:bookmarkEnd w:id="61"/>
+    <w:bookmarkStart w:id="65" w:name="sec-raamwerk"/>
+    <w:p>
+      <w:pPr>
+        <w:pStyle w:val="Heading1"/>
+      </w:pPr>
+      <w:r>
+        <w:t xml:space="preserve">3. DigComp 3.0 raamwerk</w:t>
+      </w:r>
+    </w:p>
+    <w:bookmarkStart w:id="62" w:name="hoe-moet-je-het-raamwerk-lezen"/>
+    <w:p>
+      <w:pPr>
+        <w:pStyle w:val="Heading2"/>
+      </w:pPr>
+      <w:r>
+        <w:t xml:space="preserve">3.1 Hoe moet je het raamwerk lezen?</w:t>
+      </w:r>
+    </w:p>
+    <w:p>
+      <w:pPr>
+        <w:pStyle w:val="FirstParagraph"/>
+      </w:pPr>
+      <w:r>
+        <w:rPr>
+          <w:highlight w:val="yellow"/>
+        </w:rPr>
+        <w:t xml:space="preserve">Hier moet een mooi plaatje komen met hoe je de tabel die volgt moet lezen, vergelijkbaar met pagina 9 van de vorige keer.</w:t>
+      </w:r>
+    </w:p>
     <w:bookmarkEnd w:id="62"/>
-    <w:bookmarkStart w:id="66" w:name="sec-raamwerk"/>
-    <w:p>
-      <w:pPr>
-        <w:pStyle w:val="Heading1"/>
-      </w:pPr>
-      <w:r>
-        <w:t xml:space="preserve">3. DigComp 3.0 raamwerk</w:t>
-      </w:r>
-    </w:p>
-    <w:bookmarkStart w:id="63" w:name="hoe-moet-je-het-raamwerk-lezen"/>
-    <w:p>
-      <w:pPr>
-        <w:pStyle w:val="Heading2"/>
-      </w:pPr>
-      <w:r>
-        <w:t xml:space="preserve">3.1 Hoe moet je het raamwerk lezen?</w:t>
-      </w:r>
-    </w:p>
-    <w:p>
-      <w:pPr>
-        <w:pStyle w:val="FirstParagraph"/>
-      </w:pPr>
-      <w:r>
-        <w:rPr>
-          <w:highlight w:val="yellow"/>
-        </w:rPr>
-        <w:t xml:space="preserve">Hier moet een mooi plaatje komen met hoe je de tabel die volgt moet lezen, vergelijkbaar met pagina 9 van de vorige keer.</w:t>
-      </w:r>
-    </w:p>
-    <w:bookmarkEnd w:id="63"/>
-    <w:bookmarkStart w:id="65" w:name="digcomp-3.0"/>
+    <w:bookmarkStart w:id="64" w:name="digcomp-3.0"/>
     <w:p>
       <w:pPr>
         <w:pStyle w:val="Heading2"/>
@@ -3668,7 +3660,7 @@
       <w:tr>
         <w:tc>
           <w:tcPr/>
-          <w:bookmarkStart w:id="64" w:name="tbl-digcomp3"/>
+          <w:bookmarkStart w:id="63" w:name="tbl-digcomp3"/>
           <w:p>
             <w:pPr>
               <w:jc w:val="center"/>
@@ -3702,7 +3694,7 @@
               </w:tc>
             </w:tr>
           </w:tbl>
-          <w:bookmarkEnd w:id="64"/>
+          <w:bookmarkEnd w:id="63"/>
           <w:p/>
         </w:tc>
       </w:tr>
@@ -3726,9 +3718,14 @@
         <w:t xml:space="preserve">tabel digcomp3 is ook als los .docx-bestand beschikbaar: DigComp3_digcomp3_nl.docx</w:t>
       </w:r>
     </w:p>
+    <w:p>
+      <w:r>
+        <w:br w:type="page"/>
+      </w:r>
+    </w:p>
+    <w:bookmarkEnd w:id="64"/>
     <w:bookmarkEnd w:id="65"/>
-    <w:bookmarkEnd w:id="66"/>
-    <w:bookmarkStart w:id="68" w:name="sec-bijlage-leerresultaten"/>
+    <w:bookmarkStart w:id="67" w:name="sec-bijlage-leerresultaten"/>
     <w:p>
       <w:pPr>
         <w:pStyle w:val="Heading1"/>
@@ -3750,7 +3747,7 @@
       <w:tr>
         <w:tc>
           <w:tcPr/>
-          <w:bookmarkStart w:id="67" w:name="tbl-outcomes"/>
+          <w:bookmarkStart w:id="66" w:name="tbl-outcomes"/>
           <w:p>
             <w:pPr>
               <w:jc w:val="center"/>
@@ -3784,7 +3781,7 @@
               </w:tc>
             </w:tr>
           </w:tbl>
-          <w:bookmarkEnd w:id="67"/>
+          <w:bookmarkEnd w:id="66"/>
           <w:p/>
         </w:tc>
       </w:tr>
@@ -3824,8 +3821,8 @@
         <w:br w:type="page"/>
       </w:r>
     </w:p>
-    <w:bookmarkEnd w:id="68"/>
-    <w:bookmarkStart w:id="70" w:name="sec-woordenlijst"/>
+    <w:bookmarkEnd w:id="67"/>
+    <w:bookmarkStart w:id="69" w:name="sec-woordenlijst"/>
     <w:p>
       <w:pPr>
         <w:pStyle w:val="Heading1"/>
@@ -3847,7 +3844,7 @@
       <w:tr>
         <w:tc>
           <w:tcPr/>
-          <w:bookmarkStart w:id="69" w:name="tbl-woordenlijst"/>
+          <w:bookmarkStart w:id="68" w:name="tbl-woordenlijst"/>
           <w:p>
             <w:pPr>
               <w:jc w:val="center"/>
@@ -3881,7 +3878,7 @@
               </w:tc>
             </w:tr>
           </w:tbl>
-          <w:bookmarkEnd w:id="69"/>
+          <w:bookmarkEnd w:id="68"/>
           <w:p/>
         </w:tc>
       </w:tr>
@@ -3921,44 +3918,44 @@
         <w:br w:type="page"/>
       </w:r>
     </w:p>
+    <w:bookmarkEnd w:id="69"/>
+    <w:bookmarkStart w:id="70" w:name="aanvullende-bronnen"/>
+    <w:p>
+      <w:pPr>
+        <w:pStyle w:val="Heading1"/>
+      </w:pPr>
+      <w:r>
+        <w:t xml:space="preserve">6. Aanvullende bronnen</w:t>
+      </w:r>
+    </w:p>
+    <w:p>
+      <w:pPr>
+        <w:pStyle w:val="FirstParagraph"/>
+      </w:pPr>
+      <w:r>
+        <w:rPr>
+          <w:highlight w:val="yellow"/>
+        </w:rPr>
+        <w:t xml:space="preserve">Hier moet nog uitleg over de Excel en de JSON-D die ook te downloaden zijn van de iXperium website</w:t>
+      </w:r>
+    </w:p>
+    <w:p>
+      <w:r>
+        <w:br w:type="page"/>
+      </w:r>
+    </w:p>
     <w:bookmarkEnd w:id="70"/>
-    <w:bookmarkStart w:id="71" w:name="aanvullende-bronnen"/>
+    <w:bookmarkStart w:id="148" w:name="literatuur"/>
     <w:p>
       <w:pPr>
         <w:pStyle w:val="Heading1"/>
       </w:pPr>
       <w:r>
-        <w:t xml:space="preserve">6. Aanvullende bronnen</w:t>
-      </w:r>
-    </w:p>
-    <w:p>
-      <w:pPr>
-        <w:pStyle w:val="FirstParagraph"/>
-      </w:pPr>
-      <w:r>
-        <w:rPr>
-          <w:highlight w:val="yellow"/>
-        </w:rPr>
-        <w:t xml:space="preserve">Hier moet nog uitleg over de Excel en de JSON-D die ook te downloaden zijn van de iXperium website</w:t>
-      </w:r>
-    </w:p>
-    <w:p>
-      <w:r>
-        <w:br w:type="page"/>
-      </w:r>
-    </w:p>
-    <w:bookmarkEnd w:id="71"/>
-    <w:bookmarkStart w:id="149" w:name="literatuur"/>
-    <w:p>
-      <w:pPr>
-        <w:pStyle w:val="Heading1"/>
-      </w:pPr>
-      <w:r>
         <w:t xml:space="preserve">Literatuur</w:t>
       </w:r>
     </w:p>
-    <w:bookmarkStart w:id="148" w:name="refs"/>
-    <w:bookmarkStart w:id="73" w:name="ref-Abendroth-Dias2025"/>
+    <w:bookmarkStart w:id="147" w:name="refs"/>
+    <w:bookmarkStart w:id="72" w:name="ref-Abendroth-Dias2025"/>
     <w:p>
       <w:pPr>
         <w:pStyle w:val="Bibliography"/>
@@ -4013,7 +4010,7 @@
       <w:r>
         <w:t xml:space="preserve"> </w:t>
       </w:r>
-      <w:hyperlink r:id="rId72">
+      <w:hyperlink r:id="rId71">
         <w:r>
           <w:rPr>
             <w:rStyle w:val="Hyperlink"/>
@@ -4022,8 +4019,8 @@
         </w:r>
       </w:hyperlink>
     </w:p>
-    <w:bookmarkEnd w:id="73"/>
-    <w:bookmarkStart w:id="75" w:name="ref-Boerkamp2024"/>
+    <w:bookmarkEnd w:id="72"/>
+    <w:bookmarkStart w:id="74" w:name="ref-Boerkamp2024"/>
     <w:p>
       <w:pPr>
         <w:pStyle w:val="Bibliography"/>
@@ -4060,7 +4057,7 @@
       <w:r>
         <w:t xml:space="preserve"> </w:t>
       </w:r>
-      <w:hyperlink r:id="rId74">
+      <w:hyperlink r:id="rId73">
         <w:r>
           <w:rPr>
             <w:rStyle w:val="Hyperlink"/>
@@ -4069,8 +4066,8 @@
         </w:r>
       </w:hyperlink>
     </w:p>
-    <w:bookmarkEnd w:id="75"/>
-    <w:bookmarkStart w:id="77" w:name="ref-Brundle2025"/>
+    <w:bookmarkEnd w:id="74"/>
+    <w:bookmarkStart w:id="76" w:name="ref-Brundle2025"/>
     <w:p>
       <w:pPr>
         <w:pStyle w:val="Bibliography"/>
@@ -4119,7 +4116,7 @@
       <w:r>
         <w:t xml:space="preserve"> </w:t>
       </w:r>
-      <w:hyperlink r:id="rId76">
+      <w:hyperlink r:id="rId75">
         <w:r>
           <w:rPr>
             <w:rStyle w:val="Hyperlink"/>
@@ -4128,8 +4125,8 @@
         </w:r>
       </w:hyperlink>
     </w:p>
-    <w:bookmarkEnd w:id="77"/>
-    <w:bookmarkStart w:id="79" w:name="ref-Cedefop2017"/>
+    <w:bookmarkEnd w:id="76"/>
+    <w:bookmarkStart w:id="78" w:name="ref-Cedefop2017"/>
     <w:p>
       <w:pPr>
         <w:pStyle w:val="Bibliography"/>
@@ -4153,7 +4150,7 @@
       <w:r>
         <w:t xml:space="preserve"> </w:t>
       </w:r>
-      <w:hyperlink r:id="rId78">
+      <w:hyperlink r:id="rId77">
         <w:r>
           <w:rPr>
             <w:rStyle w:val="Hyperlink"/>
@@ -4162,8 +4159,8 @@
         </w:r>
       </w:hyperlink>
     </w:p>
-    <w:bookmarkEnd w:id="79"/>
-    <w:bookmarkStart w:id="81" w:name="ref-Cedefop2022"/>
+    <w:bookmarkEnd w:id="78"/>
+    <w:bookmarkStart w:id="80" w:name="ref-Cedefop2022"/>
     <w:p>
       <w:pPr>
         <w:pStyle w:val="Bibliography"/>
@@ -4187,7 +4184,7 @@
       <w:r>
         <w:t xml:space="preserve"> </w:t>
       </w:r>
-      <w:hyperlink r:id="rId80">
+      <w:hyperlink r:id="rId79">
         <w:r>
           <w:rPr>
             <w:rStyle w:val="Hyperlink"/>
@@ -4196,8 +4193,8 @@
         </w:r>
       </w:hyperlink>
     </w:p>
-    <w:bookmarkEnd w:id="81"/>
-    <w:bookmarkStart w:id="83" w:name="ref-Cedefop2024a"/>
+    <w:bookmarkEnd w:id="80"/>
+    <w:bookmarkStart w:id="82" w:name="ref-Cedefop2024a"/>
     <w:p>
       <w:pPr>
         <w:pStyle w:val="Bibliography"/>
@@ -4221,7 +4218,7 @@
       <w:r>
         <w:t xml:space="preserve"> </w:t>
       </w:r>
-      <w:hyperlink r:id="rId82">
+      <w:hyperlink r:id="rId81">
         <w:r>
           <w:rPr>
             <w:rStyle w:val="Hyperlink"/>
@@ -4230,8 +4227,8 @@
         </w:r>
       </w:hyperlink>
     </w:p>
-    <w:bookmarkEnd w:id="83"/>
-    <w:bookmarkStart w:id="85" w:name="ref-Centeno2025"/>
+    <w:bookmarkEnd w:id="82"/>
+    <w:bookmarkStart w:id="84" w:name="ref-Centeno2025"/>
     <w:p>
       <w:pPr>
         <w:pStyle w:val="Bibliography"/>
@@ -4255,7 +4252,7 @@
       <w:r>
         <w:t xml:space="preserve"> </w:t>
       </w:r>
-      <w:hyperlink r:id="rId84">
+      <w:hyperlink r:id="rId83">
         <w:r>
           <w:rPr>
             <w:rStyle w:val="Hyperlink"/>
@@ -4264,8 +4261,8 @@
         </w:r>
       </w:hyperlink>
     </w:p>
-    <w:bookmarkEnd w:id="85"/>
-    <w:bookmarkStart w:id="87" w:name="ref-Centeno2024a"/>
+    <w:bookmarkEnd w:id="84"/>
+    <w:bookmarkStart w:id="86" w:name="ref-Centeno2024a"/>
     <w:p>
       <w:pPr>
         <w:pStyle w:val="Bibliography"/>
@@ -4303,7 +4300,7 @@
       <w:r>
         <w:t xml:space="preserve"> </w:t>
       </w:r>
-      <w:hyperlink r:id="rId86">
+      <w:hyperlink r:id="rId85">
         <w:r>
           <w:rPr>
             <w:rStyle w:val="Hyperlink"/>
@@ -4312,8 +4309,8 @@
         </w:r>
       </w:hyperlink>
     </w:p>
-    <w:bookmarkEnd w:id="87"/>
-    <w:bookmarkStart w:id="88" w:name="ref-Centeno2024b"/>
+    <w:bookmarkEnd w:id="86"/>
+    <w:bookmarkStart w:id="87" w:name="ref-Centeno2024b"/>
     <w:p>
       <w:pPr>
         <w:pStyle w:val="Bibliography"/>
@@ -4351,7 +4348,7 @@
       <w:r>
         <w:t xml:space="preserve"> </w:t>
       </w:r>
-      <w:hyperlink r:id="rId86">
+      <w:hyperlink r:id="rId85">
         <w:r>
           <w:rPr>
             <w:rStyle w:val="Hyperlink"/>
@@ -4360,8 +4357,8 @@
         </w:r>
       </w:hyperlink>
     </w:p>
-    <w:bookmarkEnd w:id="88"/>
-    <w:bookmarkStart w:id="90" w:name="ref-Chen2023"/>
+    <w:bookmarkEnd w:id="87"/>
+    <w:bookmarkStart w:id="89" w:name="ref-Chen2023"/>
     <w:p>
       <w:pPr>
         <w:pStyle w:val="Bibliography"/>
@@ -4398,7 +4395,7 @@
       <w:r>
         <w:t xml:space="preserve"> </w:t>
       </w:r>
-      <w:hyperlink r:id="rId89">
+      <w:hyperlink r:id="rId88">
         <w:r>
           <w:rPr>
             <w:rStyle w:val="Hyperlink"/>
@@ -4407,8 +4404,8 @@
         </w:r>
       </w:hyperlink>
     </w:p>
-    <w:bookmarkEnd w:id="90"/>
-    <w:bookmarkStart w:id="92" w:name="ref-DiVinadio2022"/>
+    <w:bookmarkEnd w:id="89"/>
+    <w:bookmarkStart w:id="91" w:name="ref-DiVinadio2022"/>
     <w:p>
       <w:pPr>
         <w:pStyle w:val="Bibliography"/>
@@ -4432,7 +4429,7 @@
       <w:r>
         <w:t xml:space="preserve"> </w:t>
       </w:r>
-      <w:hyperlink r:id="rId91">
+      <w:hyperlink r:id="rId90">
         <w:r>
           <w:rPr>
             <w:rStyle w:val="Hyperlink"/>
@@ -4441,8 +4438,8 @@
         </w:r>
       </w:hyperlink>
     </w:p>
-    <w:bookmarkEnd w:id="92"/>
-    <w:bookmarkStart w:id="94" w:name="ref-Draghi2024"/>
+    <w:bookmarkEnd w:id="91"/>
+    <w:bookmarkStart w:id="93" w:name="ref-Draghi2024"/>
     <w:p>
       <w:pPr>
         <w:pStyle w:val="Bibliography"/>
@@ -4466,7 +4463,7 @@
       <w:r>
         <w:t xml:space="preserve"> </w:t>
       </w:r>
-      <w:hyperlink r:id="rId93">
+      <w:hyperlink r:id="rId92">
         <w:r>
           <w:rPr>
             <w:rStyle w:val="Hyperlink"/>
@@ -4475,8 +4472,8 @@
         </w:r>
       </w:hyperlink>
     </w:p>
-    <w:bookmarkEnd w:id="94"/>
-    <w:bookmarkStart w:id="96" w:name="ref-Duckworth2025"/>
+    <w:bookmarkEnd w:id="93"/>
+    <w:bookmarkStart w:id="95" w:name="ref-Duckworth2025"/>
     <w:p>
       <w:pPr>
         <w:pStyle w:val="Bibliography"/>
@@ -4503,7 +4500,7 @@
       <w:r>
         <w:t xml:space="preserve"> </w:t>
       </w:r>
-      <w:hyperlink r:id="rId95">
+      <w:hyperlink r:id="rId94">
         <w:r>
           <w:rPr>
             <w:rStyle w:val="Hyperlink"/>
@@ -4512,8 +4509,8 @@
         </w:r>
       </w:hyperlink>
     </w:p>
-    <w:bookmarkEnd w:id="96"/>
-    <w:bookmarkStart w:id="98" w:name="ref-Commission2012"/>
+    <w:bookmarkEnd w:id="95"/>
+    <w:bookmarkStart w:id="97" w:name="ref-Commission2012"/>
     <w:p>
       <w:pPr>
         <w:pStyle w:val="Bibliography"/>
@@ -4537,7 +4534,7 @@
       <w:r>
         <w:t xml:space="preserve"> </w:t>
       </w:r>
-      <w:hyperlink r:id="rId97">
+      <w:hyperlink r:id="rId96">
         <w:r>
           <w:rPr>
             <w:rStyle w:val="Hyperlink"/>
@@ -4546,8 +4543,8 @@
         </w:r>
       </w:hyperlink>
     </w:p>
-    <w:bookmarkEnd w:id="98"/>
-    <w:bookmarkStart w:id="100" w:name="ref-Commission2018"/>
+    <w:bookmarkEnd w:id="97"/>
+    <w:bookmarkStart w:id="99" w:name="ref-Commission2018"/>
     <w:p>
       <w:pPr>
         <w:pStyle w:val="Bibliography"/>
@@ -4571,7 +4568,7 @@
       <w:r>
         <w:t xml:space="preserve"> </w:t>
       </w:r>
-      <w:hyperlink r:id="rId99">
+      <w:hyperlink r:id="rId98">
         <w:r>
           <w:rPr>
             <w:rStyle w:val="Hyperlink"/>
@@ -4580,8 +4577,8 @@
         </w:r>
       </w:hyperlink>
     </w:p>
-    <w:bookmarkEnd w:id="100"/>
-    <w:bookmarkStart w:id="102" w:name="ref-Commission2023b"/>
+    <w:bookmarkEnd w:id="99"/>
+    <w:bookmarkStart w:id="101" w:name="ref-Commission2023b"/>
     <w:p>
       <w:pPr>
         <w:pStyle w:val="Bibliography"/>
@@ -4605,7 +4602,7 @@
       <w:r>
         <w:t xml:space="preserve"> </w:t>
       </w:r>
-      <w:hyperlink r:id="rId101">
+      <w:hyperlink r:id="rId100">
         <w:r>
           <w:rPr>
             <w:rStyle w:val="Hyperlink"/>
@@ -4614,8 +4611,8 @@
         </w:r>
       </w:hyperlink>
     </w:p>
-    <w:bookmarkEnd w:id="102"/>
-    <w:bookmarkStart w:id="104" w:name="ref-Commission2023a"/>
+    <w:bookmarkEnd w:id="101"/>
+    <w:bookmarkStart w:id="103" w:name="ref-Commission2023a"/>
     <w:p>
       <w:pPr>
         <w:pStyle w:val="Bibliography"/>
@@ -4639,7 +4636,7 @@
       <w:r>
         <w:t xml:space="preserve"> </w:t>
       </w:r>
-      <w:hyperlink r:id="rId103">
+      <w:hyperlink r:id="rId102">
         <w:r>
           <w:rPr>
             <w:rStyle w:val="Hyperlink"/>
@@ -4648,8 +4645,8 @@
         </w:r>
       </w:hyperlink>
     </w:p>
-    <w:bookmarkEnd w:id="104"/>
-    <w:bookmarkStart w:id="106" w:name="ref-Commission2025b"/>
+    <w:bookmarkEnd w:id="103"/>
+    <w:bookmarkStart w:id="105" w:name="ref-Commission2025b"/>
     <w:p>
       <w:pPr>
         <w:pStyle w:val="Bibliography"/>
@@ -4673,7 +4670,7 @@
       <w:r>
         <w:t xml:space="preserve"> </w:t>
       </w:r>
-      <w:hyperlink r:id="rId105">
+      <w:hyperlink r:id="rId104">
         <w:r>
           <w:rPr>
             <w:rStyle w:val="Hyperlink"/>
@@ -4682,8 +4679,8 @@
         </w:r>
       </w:hyperlink>
     </w:p>
-    <w:bookmarkEnd w:id="106"/>
-    <w:bookmarkStart w:id="107" w:name="ref-Commission2025f"/>
+    <w:bookmarkEnd w:id="105"/>
+    <w:bookmarkStart w:id="106" w:name="ref-Commission2025f"/>
     <w:p>
       <w:pPr>
         <w:pStyle w:val="Bibliography"/>
@@ -4721,7 +4718,7 @@
       <w:r>
         <w:t xml:space="preserve"> </w:t>
       </w:r>
-      <w:hyperlink r:id="rId60">
+      <w:hyperlink r:id="rId59">
         <w:r>
           <w:rPr>
             <w:rStyle w:val="Hyperlink"/>
@@ -4730,8 +4727,8 @@
         </w:r>
       </w:hyperlink>
     </w:p>
-    <w:bookmarkEnd w:id="107"/>
-    <w:bookmarkStart w:id="109" w:name="ref-Commission2025a"/>
+    <w:bookmarkEnd w:id="106"/>
+    <w:bookmarkStart w:id="108" w:name="ref-Commission2025a"/>
     <w:p>
       <w:pPr>
         <w:pStyle w:val="Bibliography"/>
@@ -4783,7 +4780,7 @@
       <w:r>
         <w:t xml:space="preserve"> </w:t>
       </w:r>
-      <w:hyperlink r:id="rId108">
+      <w:hyperlink r:id="rId107">
         <w:r>
           <w:rPr>
             <w:rStyle w:val="Hyperlink"/>
@@ -4792,8 +4789,8 @@
         </w:r>
       </w:hyperlink>
     </w:p>
-    <w:bookmarkEnd w:id="109"/>
-    <w:bookmarkStart w:id="111" w:name="ref-Eurostat2025"/>
+    <w:bookmarkEnd w:id="108"/>
+    <w:bookmarkStart w:id="110" w:name="ref-Eurostat2025"/>
     <w:p>
       <w:pPr>
         <w:pStyle w:val="Bibliography"/>
@@ -4845,7 +4842,7 @@
       <w:r>
         <w:t xml:space="preserve"> </w:t>
       </w:r>
-      <w:hyperlink r:id="rId110">
+      <w:hyperlink r:id="rId109">
         <w:r>
           <w:rPr>
             <w:rStyle w:val="Hyperlink"/>
@@ -4854,8 +4851,8 @@
         </w:r>
       </w:hyperlink>
     </w:p>
-    <w:bookmarkEnd w:id="111"/>
-    <w:bookmarkStart w:id="113" w:name="ref-FariasGaytan2023"/>
+    <w:bookmarkEnd w:id="110"/>
+    <w:bookmarkStart w:id="112" w:name="ref-FariasGaytan2023"/>
     <w:p>
       <w:pPr>
         <w:pStyle w:val="Bibliography"/>
@@ -4892,7 +4889,7 @@
       <w:r>
         <w:t xml:space="preserve"> </w:t>
       </w:r>
-      <w:hyperlink r:id="rId112">
+      <w:hyperlink r:id="rId111">
         <w:r>
           <w:rPr>
             <w:rStyle w:val="Hyperlink"/>
@@ -4901,8 +4898,8 @@
         </w:r>
       </w:hyperlink>
     </w:p>
-    <w:bookmarkEnd w:id="113"/>
-    <w:bookmarkStart w:id="115" w:name="ref-Kluzer2020"/>
+    <w:bookmarkEnd w:id="112"/>
+    <w:bookmarkStart w:id="114" w:name="ref-Kluzer2020"/>
     <w:p>
       <w:pPr>
         <w:pStyle w:val="Bibliography"/>
@@ -4926,7 +4923,7 @@
       <w:r>
         <w:t xml:space="preserve"> </w:t>
       </w:r>
-      <w:hyperlink r:id="rId114">
+      <w:hyperlink r:id="rId113">
         <w:r>
           <w:rPr>
             <w:rStyle w:val="Hyperlink"/>
@@ -4935,8 +4932,8 @@
         </w:r>
       </w:hyperlink>
     </w:p>
-    <w:bookmarkEnd w:id="115"/>
-    <w:bookmarkStart w:id="117" w:name="ref-Lewandowsky2020"/>
+    <w:bookmarkEnd w:id="114"/>
+    <w:bookmarkStart w:id="116" w:name="ref-Lewandowsky2020"/>
     <w:p>
       <w:pPr>
         <w:pStyle w:val="Bibliography"/>
@@ -4960,7 +4957,7 @@
       <w:r>
         <w:t xml:space="preserve"> </w:t>
       </w:r>
-      <w:hyperlink r:id="rId116">
+      <w:hyperlink r:id="rId115">
         <w:r>
           <w:rPr>
             <w:rStyle w:val="Hyperlink"/>
@@ -4969,8 +4966,8 @@
         </w:r>
       </w:hyperlink>
     </w:p>
-    <w:bookmarkEnd w:id="117"/>
-    <w:bookmarkStart w:id="119" w:name="ref-Long2020"/>
+    <w:bookmarkEnd w:id="116"/>
+    <w:bookmarkStart w:id="118" w:name="ref-Long2020"/>
     <w:p>
       <w:pPr>
         <w:pStyle w:val="Bibliography"/>
@@ -5034,7 +5031,7 @@
       <w:r>
         <w:t xml:space="preserve"> </w:t>
       </w:r>
-      <w:hyperlink r:id="rId118">
+      <w:hyperlink r:id="rId117">
         <w:r>
           <w:rPr>
             <w:rStyle w:val="Hyperlink"/>
@@ -5043,8 +5040,8 @@
         </w:r>
       </w:hyperlink>
     </w:p>
-    <w:bookmarkEnd w:id="119"/>
-    <w:bookmarkStart w:id="121" w:name="ref-Miao2024"/>
+    <w:bookmarkEnd w:id="118"/>
+    <w:bookmarkStart w:id="120" w:name="ref-Miao2024"/>
     <w:p>
       <w:pPr>
         <w:pStyle w:val="Bibliography"/>
@@ -5082,7 +5079,7 @@
       <w:r>
         <w:t xml:space="preserve"> </w:t>
       </w:r>
-      <w:hyperlink r:id="rId120">
+      <w:hyperlink r:id="rId119">
         <w:r>
           <w:rPr>
             <w:rStyle w:val="Hyperlink"/>
@@ -5091,8 +5088,8 @@
         </w:r>
       </w:hyperlink>
     </w:p>
-    <w:bookmarkEnd w:id="121"/>
-    <w:bookmarkStart w:id="123" w:name="ref-Mills2024"/>
+    <w:bookmarkEnd w:id="120"/>
+    <w:bookmarkStart w:id="122" w:name="ref-Mills2024"/>
     <w:p>
       <w:pPr>
         <w:pStyle w:val="Bibliography"/>
@@ -5130,7 +5127,7 @@
       <w:r>
         <w:t xml:space="preserve"> </w:t>
       </w:r>
-      <w:hyperlink r:id="rId122">
+      <w:hyperlink r:id="rId121">
         <w:r>
           <w:rPr>
             <w:rStyle w:val="Hyperlink"/>
@@ -5139,8 +5136,8 @@
         </w:r>
       </w:hyperlink>
     </w:p>
-    <w:bookmarkEnd w:id="123"/>
-    <w:bookmarkStart w:id="125" w:name="ref-MorteNadal2025"/>
+    <w:bookmarkEnd w:id="122"/>
+    <w:bookmarkStart w:id="124" w:name="ref-MorteNadal2025"/>
     <w:p>
       <w:pPr>
         <w:pStyle w:val="Bibliography"/>
@@ -5177,7 +5174,7 @@
       <w:r>
         <w:t xml:space="preserve"> </w:t>
       </w:r>
-      <w:hyperlink r:id="rId124">
+      <w:hyperlink r:id="rId123">
         <w:r>
           <w:rPr>
             <w:rStyle w:val="Hyperlink"/>
@@ -5186,8 +5183,8 @@
         </w:r>
       </w:hyperlink>
     </w:p>
-    <w:bookmarkEnd w:id="125"/>
-    <w:bookmarkStart w:id="127" w:name="ref-Ng2021"/>
+    <w:bookmarkEnd w:id="124"/>
+    <w:bookmarkStart w:id="126" w:name="ref-Ng2021"/>
     <w:p>
       <w:pPr>
         <w:pStyle w:val="Bibliography"/>
@@ -5236,7 +5233,7 @@
       <w:r>
         <w:t xml:space="preserve"> </w:t>
       </w:r>
-      <w:hyperlink r:id="rId126">
+      <w:hyperlink r:id="rId125">
         <w:r>
           <w:rPr>
             <w:rStyle w:val="Hyperlink"/>
@@ -5245,8 +5242,8 @@
         </w:r>
       </w:hyperlink>
     </w:p>
-    <w:bookmarkEnd w:id="127"/>
-    <w:bookmarkStart w:id="129" w:name="ref-OECD2025"/>
+    <w:bookmarkEnd w:id="126"/>
+    <w:bookmarkStart w:id="128" w:name="ref-OECD2025"/>
     <w:p>
       <w:pPr>
         <w:pStyle w:val="Bibliography"/>
@@ -5319,7 +5316,7 @@
       <w:r>
         <w:t xml:space="preserve"> </w:t>
       </w:r>
-      <w:hyperlink r:id="rId128">
+      <w:hyperlink r:id="rId127">
         <w:r>
           <w:rPr>
             <w:rStyle w:val="Hyperlink"/>
@@ -5328,8 +5325,8 @@
         </w:r>
       </w:hyperlink>
     </w:p>
-    <w:bookmarkEnd w:id="129"/>
-    <w:bookmarkStart w:id="131" w:name="ref-OnesiOzigagun2024"/>
+    <w:bookmarkEnd w:id="128"/>
+    <w:bookmarkStart w:id="130" w:name="ref-OnesiOzigagun2024"/>
     <w:p>
       <w:pPr>
         <w:pStyle w:val="Bibliography"/>
@@ -5375,7 +5372,7 @@
       <w:r>
         <w:t xml:space="preserve"> </w:t>
       </w:r>
-      <w:hyperlink r:id="rId130">
+      <w:hyperlink r:id="rId129">
         <w:r>
           <w:rPr>
             <w:rStyle w:val="Hyperlink"/>
@@ -5384,8 +5381,8 @@
         </w:r>
       </w:hyperlink>
     </w:p>
-    <w:bookmarkEnd w:id="131"/>
-    <w:bookmarkStart w:id="133" w:name="ref-Pakhnenko2025"/>
+    <w:bookmarkEnd w:id="130"/>
+    <w:bookmarkStart w:id="132" w:name="ref-Pakhnenko2025"/>
     <w:p>
       <w:pPr>
         <w:pStyle w:val="Bibliography"/>
@@ -5422,7 +5419,7 @@
       <w:r>
         <w:t xml:space="preserve"> </w:t>
       </w:r>
-      <w:hyperlink r:id="rId132">
+      <w:hyperlink r:id="rId131">
         <w:r>
           <w:rPr>
             <w:rStyle w:val="Hyperlink"/>
@@ -5431,8 +5428,8 @@
         </w:r>
       </w:hyperlink>
     </w:p>
-    <w:bookmarkEnd w:id="133"/>
-    <w:bookmarkStart w:id="135" w:name="ref-Pouliakas2025"/>
+    <w:bookmarkEnd w:id="132"/>
+    <w:bookmarkStart w:id="134" w:name="ref-Pouliakas2025"/>
     <w:p>
       <w:pPr>
         <w:pStyle w:val="Bibliography"/>
@@ -5468,7 +5465,7 @@
       <w:r>
         <w:t xml:space="preserve"> </w:t>
       </w:r>
-      <w:hyperlink r:id="rId134">
+      <w:hyperlink r:id="rId133">
         <w:r>
           <w:rPr>
             <w:rStyle w:val="Hyperlink"/>
@@ -5477,8 +5474,8 @@
         </w:r>
       </w:hyperlink>
     </w:p>
-    <w:bookmarkEnd w:id="135"/>
-    <w:bookmarkStart w:id="137" w:name="ref-Stalmach2023"/>
+    <w:bookmarkEnd w:id="134"/>
+    <w:bookmarkStart w:id="136" w:name="ref-Stalmach2023"/>
     <w:p>
       <w:pPr>
         <w:pStyle w:val="Bibliography"/>
@@ -5515,7 +5512,7 @@
       <w:r>
         <w:t xml:space="preserve"> </w:t>
       </w:r>
-      <w:hyperlink r:id="rId136">
+      <w:hyperlink r:id="rId135">
         <w:r>
           <w:rPr>
             <w:rStyle w:val="Hyperlink"/>
@@ -5524,8 +5521,8 @@
         </w:r>
       </w:hyperlink>
     </w:p>
-    <w:bookmarkEnd w:id="137"/>
-    <w:bookmarkStart w:id="139" w:name="ref-Tarca2024"/>
+    <w:bookmarkEnd w:id="136"/>
+    <w:bookmarkStart w:id="138" w:name="ref-Tarca2024"/>
     <w:p>
       <w:pPr>
         <w:pStyle w:val="Bibliography"/>
@@ -5571,7 +5568,7 @@
       <w:r>
         <w:t xml:space="preserve"> </w:t>
       </w:r>
-      <w:hyperlink r:id="rId138">
+      <w:hyperlink r:id="rId137">
         <w:r>
           <w:rPr>
             <w:rStyle w:val="Hyperlink"/>
@@ -5580,8 +5577,8 @@
         </w:r>
       </w:hyperlink>
     </w:p>
-    <w:bookmarkEnd w:id="139"/>
-    <w:bookmarkStart w:id="141" w:name="ref-Touretzky2019"/>
+    <w:bookmarkEnd w:id="138"/>
+    <w:bookmarkStart w:id="140" w:name="ref-Touretzky2019"/>
     <w:p>
       <w:pPr>
         <w:pStyle w:val="Bibliography"/>
@@ -5676,7 +5673,7 @@
       <w:r>
         <w:t xml:space="preserve"> </w:t>
       </w:r>
-      <w:hyperlink r:id="rId140">
+      <w:hyperlink r:id="rId139">
         <w:r>
           <w:rPr>
             <w:rStyle w:val="Hyperlink"/>
@@ -5685,8 +5682,8 @@
         </w:r>
       </w:hyperlink>
     </w:p>
-    <w:bookmarkEnd w:id="141"/>
-    <w:bookmarkStart w:id="143" w:name="ref-Touretzky2023"/>
+    <w:bookmarkEnd w:id="140"/>
+    <w:bookmarkStart w:id="142" w:name="ref-Touretzky2023"/>
     <w:p>
       <w:pPr>
         <w:pStyle w:val="Bibliography"/>
@@ -5723,7 +5720,7 @@
       <w:r>
         <w:t xml:space="preserve"> </w:t>
       </w:r>
-      <w:hyperlink r:id="rId142">
+      <w:hyperlink r:id="rId141">
         <w:r>
           <w:rPr>
             <w:rStyle w:val="Hyperlink"/>
@@ -5732,8 +5729,8 @@
         </w:r>
       </w:hyperlink>
     </w:p>
-    <w:bookmarkEnd w:id="143"/>
-    <w:bookmarkStart w:id="145" w:name="ref-UNESCO2022"/>
+    <w:bookmarkEnd w:id="142"/>
+    <w:bookmarkStart w:id="144" w:name="ref-UNESCO2022"/>
     <w:p>
       <w:pPr>
         <w:pStyle w:val="Bibliography"/>
@@ -5799,7 +5796,7 @@
       <w:r>
         <w:t xml:space="preserve"> </w:t>
       </w:r>
-      <w:hyperlink r:id="rId144">
+      <w:hyperlink r:id="rId143">
         <w:r>
           <w:rPr>
             <w:rStyle w:val="Hyperlink"/>
@@ -5808,8 +5805,8 @@
         </w:r>
       </w:hyperlink>
     </w:p>
-    <w:bookmarkEnd w:id="145"/>
-    <w:bookmarkStart w:id="147" w:name="ref-Vuorikari2022b"/>
+    <w:bookmarkEnd w:id="144"/>
+    <w:bookmarkStart w:id="146" w:name="ref-Vuorikari2022b"/>
     <w:p>
       <w:pPr>
         <w:pStyle w:val="Bibliography"/>
@@ -5854,7 +5851,7 @@
       <w:r>
         <w:t xml:space="preserve"> </w:t>
       </w:r>
-      <w:hyperlink r:id="rId146">
+      <w:hyperlink r:id="rId145">
         <w:r>
           <w:rPr>
             <w:rStyle w:val="Hyperlink"/>
@@ -5863,9 +5860,9 @@
         </w:r>
       </w:hyperlink>
     </w:p>
+    <w:bookmarkEnd w:id="146"/>
     <w:bookmarkEnd w:id="147"/>
     <w:bookmarkEnd w:id="148"/>
-    <w:bookmarkEnd w:id="149"/>
     <w:sectPr>
       <w:footnotePr>
         <w:numRestart w:val="eachSect"/>
@@ -5990,7 +5987,7 @@
       </w:r>
     </w:p>
   </w:footnote>
-  <w:footnote w:id="59">
+  <w:footnote w:id="58">
     <w:p>
       <w:pPr>
         <w:pStyle w:val="FootnoteText"/>
@@ -6010,7 +6007,7 @@
       <w:r>
         <w:t xml:space="preserve"> </w:t>
       </w:r>
-      <w:hyperlink r:id="rId60">
+      <w:hyperlink r:id="rId59">
         <w:r>
           <w:rPr>
             <w:rStyle w:val="Hyperlink"/>

</xml_diff>